<commit_message>
Word document afspraken week 1
</commit_message>
<xml_diff>
--- a/document/Voortgang-afspraken.docx
+++ b/document/Voortgang-afspraken.docx
@@ -1,6 +1,6 @@
 
 <file path=word/document.xml><?xml version="1.0" encoding="utf-8"?>
-<w:document xmlns:wpc="http://schemas.microsoft.com/office/word/2010/wordprocessingCanvas" xmlns:cx="http://schemas.microsoft.com/office/drawing/2014/chartex" xmlns:cx1="http://schemas.microsoft.com/office/drawing/2015/9/8/chartex" xmlns:cx2="http://schemas.microsoft.com/office/drawing/2015/10/21/chartex" xmlns:cx3="http://schemas.microsoft.com/office/drawing/2016/5/9/chartex" xmlns:cx4="http://schemas.microsoft.com/office/drawing/2016/5/10/chartex" xmlns:cx5="http://schemas.microsoft.com/office/drawing/2016/5/11/chartex" xmlns:cx6="http://schemas.microsoft.com/office/drawing/2016/5/12/chartex" xmlns:cx7="http://schemas.microsoft.com/office/drawing/2016/5/13/chartex" xmlns:cx8="http://schemas.microsoft.com/office/drawing/2016/5/14/chartex" xmlns:mc="http://schemas.openxmlformats.org/markup-compatibility/2006" xmlns:aink="http://schemas.microsoft.com/office/drawing/2016/ink" xmlns:am3d="http://schemas.microsoft.com/office/drawing/2017/model3d" xmlns:o="urn:schemas-microsoft-com:office:office" xmlns:oel="http://schemas.microsoft.com/office/2019/extlst" xmlns:r="http://schemas.openxmlformats.org/officeDocument/2006/relationships" xmlns:m="http://schemas.openxmlformats.org/officeDocument/2006/math" xmlns:v="urn:schemas-microsoft-com:vml" xmlns:wp14="http://schemas.microsoft.com/office/word/2010/wordprocessingDrawing" xmlns:wp="http://schemas.openxmlformats.org/drawingml/2006/wordprocessingDrawing" xmlns:w10="urn:schemas-microsoft-com:office:word" xmlns:w="http://schemas.openxmlformats.org/wordprocessingml/2006/main" xmlns:w14="http://schemas.microsoft.com/office/word/2010/wordml" xmlns:w15="http://schemas.microsoft.com/office/word/2012/wordml" xmlns:w16cex="http://schemas.microsoft.com/office/word/2018/wordml/cex" xmlns:w16cid="http://schemas.microsoft.com/office/word/2016/wordml/cid" xmlns:w16="http://schemas.microsoft.com/office/word/2018/wordml" xmlns:w16sdtdh="http://schemas.microsoft.com/office/word/2020/wordml/sdtdatahash" xmlns:w16se="http://schemas.microsoft.com/office/word/2015/wordml/symex" xmlns:wpg="http://schemas.microsoft.com/office/word/2010/wordprocessingGroup" xmlns:wpi="http://schemas.microsoft.com/office/word/2010/wordprocessingInk" xmlns:wne="http://schemas.microsoft.com/office/word/2006/wordml" xmlns:wps="http://schemas.microsoft.com/office/word/2010/wordprocessingShape" mc:Ignorable="w14 w15 w16se w16cid w16 w16cex w16sdtdh wp14">
+<w:document xmlns:wpc="http://schemas.microsoft.com/office/word/2010/wordprocessingCanvas" xmlns:cx="http://schemas.microsoft.com/office/drawing/2014/chartex" xmlns:cx1="http://schemas.microsoft.com/office/drawing/2015/9/8/chartex" xmlns:cx2="http://schemas.microsoft.com/office/drawing/2015/10/21/chartex" xmlns:cx3="http://schemas.microsoft.com/office/drawing/2016/5/9/chartex" xmlns:cx4="http://schemas.microsoft.com/office/drawing/2016/5/10/chartex" xmlns:cx5="http://schemas.microsoft.com/office/drawing/2016/5/11/chartex" xmlns:cx6="http://schemas.microsoft.com/office/drawing/2016/5/12/chartex" xmlns:cx7="http://schemas.microsoft.com/office/drawing/2016/5/13/chartex" xmlns:cx8="http://schemas.microsoft.com/office/drawing/2016/5/14/chartex" xmlns:mc="http://schemas.openxmlformats.org/markup-compatibility/2006" xmlns:aink="http://schemas.microsoft.com/office/drawing/2016/ink" xmlns:am3d="http://schemas.microsoft.com/office/drawing/2017/model3d" xmlns:o="urn:schemas-microsoft-com:office:office" xmlns:oel="http://schemas.microsoft.com/office/2019/extlst" xmlns:r="http://schemas.openxmlformats.org/officeDocument/2006/relationships" xmlns:m="http://schemas.openxmlformats.org/officeDocument/2006/math" xmlns:v="urn:schemas-microsoft-com:vml" xmlns:wp14="http://schemas.microsoft.com/office/word/2010/wordprocessingDrawing" xmlns:wp="http://schemas.openxmlformats.org/drawingml/2006/wordprocessingDrawing" xmlns:w10="urn:schemas-microsoft-com:office:word" xmlns:w="http://schemas.openxmlformats.org/wordprocessingml/2006/main" xmlns:w14="http://schemas.microsoft.com/office/word/2010/wordml" xmlns:w15="http://schemas.microsoft.com/office/word/2012/wordml" xmlns:w16cex="http://schemas.microsoft.com/office/word/2018/wordml/cex" xmlns:w16cid="http://schemas.microsoft.com/office/word/2016/wordml/cid" xmlns:w16="http://schemas.microsoft.com/office/word/2018/wordml" xmlns:w16du="http://schemas.microsoft.com/office/word/2023/wordml/word16du" xmlns:w16sdtdh="http://schemas.microsoft.com/office/word/2020/wordml/sdtdatahash" xmlns:w16sdtfl="http://schemas.microsoft.com/office/word/2024/wordml/sdtformatlock" xmlns:w16se="http://schemas.microsoft.com/office/word/2015/wordml/symex" xmlns:wpg="http://schemas.microsoft.com/office/word/2010/wordprocessingGroup" xmlns:wpi="http://schemas.microsoft.com/office/word/2010/wordprocessingInk" xmlns:wne="http://schemas.microsoft.com/office/word/2006/wordml" xmlns:wps="http://schemas.microsoft.com/office/word/2010/wordprocessingShape" mc:Ignorable="w14 w15 w16se w16cid w16 w16cex w16sdtdh w16sdtfl w16du wp14">
   <w:body>
     <w:p>
       <w:pPr>
@@ -18,25 +18,7 @@
           <w:sz w:val="24"/>
           <w:szCs w:val="24"/>
         </w:rPr>
-        <w:t xml:space="preserve">Documentatie voor project </w:t>
-      </w:r>
-      <w:proofErr w:type="spellStart"/>
-      <w:r>
-        <w:rPr>
-          <w:rFonts w:ascii="Arial" w:hAnsi="Arial" w:cs="Arial"/>
-          <w:sz w:val="24"/>
-          <w:szCs w:val="24"/>
-        </w:rPr>
-        <w:t>Bread</w:t>
-      </w:r>
-      <w:proofErr w:type="spellEnd"/>
-      <w:r>
-        <w:rPr>
-          <w:rFonts w:ascii="Arial" w:hAnsi="Arial" w:cs="Arial"/>
-          <w:sz w:val="24"/>
-          <w:szCs w:val="24"/>
-        </w:rPr>
-        <w:t xml:space="preserve"> Company.</w:t>
+        <w:t>Documentatie voor project Bread Company.</w:t>
       </w:r>
       <w:r>
         <w:rPr>
@@ -67,7 +49,7 @@
     </w:p>
     <w:tbl>
       <w:tblPr>
-        <w:tblStyle w:val="Tabelraster"/>
+        <w:tblStyle w:val="TableGrid"/>
         <w:tblW w:w="0" w:type="auto"/>
         <w:tblLook w:val="04A0" w:firstRow="1" w:lastRow="0" w:firstColumn="1" w:lastColumn="0" w:noHBand="0" w:noVBand="1"/>
       </w:tblPr>
@@ -144,7 +126,6 @@
                 <w:szCs w:val="24"/>
               </w:rPr>
             </w:pPr>
-            <w:proofErr w:type="spellStart"/>
             <w:r>
               <w:rPr>
                 <w:rFonts w:ascii="Arial" w:hAnsi="Arial" w:cs="Arial"/>
@@ -153,28 +134,61 @@
               </w:rPr>
               <w:t>TEAMnaam</w:t>
             </w:r>
-            <w:proofErr w:type="spellEnd"/>
-          </w:p>
-        </w:tc>
-        <w:tc>
-          <w:tcPr>
-            <w:tcW w:w="4531" w:type="dxa"/>
-          </w:tcPr>
-          <w:p>
-            <w:pPr>
-              <w:rPr>
-                <w:rFonts w:ascii="Arial" w:hAnsi="Arial" w:cs="Arial"/>
-                <w:sz w:val="24"/>
-                <w:szCs w:val="24"/>
-              </w:rPr>
-            </w:pPr>
-            <w:r>
-              <w:rPr>
-                <w:rFonts w:ascii="Arial" w:hAnsi="Arial" w:cs="Arial"/>
-                <w:sz w:val="24"/>
-                <w:szCs w:val="24"/>
-              </w:rPr>
-              <w:t>SOD1.-</w:t>
+          </w:p>
+        </w:tc>
+        <w:tc>
+          <w:tcPr>
+            <w:tcW w:w="4531" w:type="dxa"/>
+          </w:tcPr>
+          <w:p>
+            <w:pPr>
+              <w:rPr>
+                <w:rFonts w:ascii="Arial" w:hAnsi="Arial" w:cs="Arial"/>
+                <w:sz w:val="24"/>
+                <w:szCs w:val="24"/>
+                <w:lang w:val="en-US"/>
+              </w:rPr>
+            </w:pPr>
+            <w:r>
+              <w:rPr>
+                <w:rFonts w:ascii="Arial" w:hAnsi="Arial" w:cs="Arial"/>
+                <w:sz w:val="24"/>
+                <w:szCs w:val="24"/>
+              </w:rPr>
+              <w:t>SOD1</w:t>
+            </w:r>
+            <w:r>
+              <w:rPr>
+                <w:rFonts w:ascii="Arial" w:hAnsi="Arial" w:cs="Arial"/>
+                <w:sz w:val="24"/>
+                <w:szCs w:val="24"/>
+              </w:rPr>
+              <w:t>A</w:t>
+            </w:r>
+            <w:r>
+              <w:rPr>
+                <w:rFonts w:ascii="Arial" w:hAnsi="Arial" w:cs="Arial"/>
+                <w:sz w:val="24"/>
+                <w:szCs w:val="24"/>
+              </w:rPr>
+              <w:t>.-</w:t>
+            </w:r>
+            <w:r>
+              <w:rPr>
+                <w:rFonts w:ascii="Arial" w:hAnsi="Arial" w:cs="Arial"/>
+                <w:sz w:val="24"/>
+                <w:szCs w:val="24"/>
+              </w:rPr>
+              <w:t xml:space="preserve">The </w:t>
+            </w:r>
+            <w:r>
+              <w:rPr>
+                <w:rFonts w:ascii="Arial" w:hAnsi="Arial" w:cs="Arial"/>
+                <w:sz w:val="24"/>
+                <w:szCs w:val="24"/>
+                <w:lang w:val="en-US"/>
+              </w:rPr>
+              <w:t>Croods</w:t>
             </w:r>
           </w:p>
         </w:tc>
@@ -220,7 +234,7 @@
                 <w:sz w:val="24"/>
                 <w:szCs w:val="24"/>
               </w:rPr>
-              <w:t>&lt;studentnaam&gt;</w:t>
+              <w:t>Senna</w:t>
             </w:r>
           </w:p>
         </w:tc>
@@ -266,7 +280,7 @@
                 <w:sz w:val="24"/>
                 <w:szCs w:val="24"/>
               </w:rPr>
-              <w:t>&lt;studentnaam&gt;</w:t>
+              <w:t>Jayden R</w:t>
             </w:r>
           </w:p>
         </w:tc>
@@ -312,7 +326,7 @@
                 <w:sz w:val="24"/>
                 <w:szCs w:val="24"/>
               </w:rPr>
-              <w:t>&lt;studentnaam&gt;</w:t>
+              <w:t>Dony</w:t>
             </w:r>
           </w:p>
         </w:tc>
@@ -358,7 +372,7 @@
                 <w:sz w:val="24"/>
                 <w:szCs w:val="24"/>
               </w:rPr>
-              <w:t>&lt;studentnaam&gt;</w:t>
+              <w:t>Tarik</w:t>
             </w:r>
           </w:p>
         </w:tc>
@@ -434,7 +448,7 @@
                 <w:sz w:val="24"/>
                 <w:szCs w:val="24"/>
               </w:rPr>
-              <w:t>&lt;naam database&gt;</w:t>
+              <w:t>the-croods</w:t>
             </w:r>
           </w:p>
         </w:tc>
@@ -472,16 +486,38 @@
                 <w:rFonts w:ascii="Arial" w:hAnsi="Arial" w:cs="Arial"/>
                 <w:sz w:val="24"/>
                 <w:szCs w:val="24"/>
-              </w:rPr>
-            </w:pPr>
-            <w:r>
-              <w:rPr>
-                <w:rFonts w:ascii="Arial" w:hAnsi="Arial" w:cs="Arial"/>
-                <w:sz w:val="24"/>
-                <w:szCs w:val="24"/>
-              </w:rPr>
-              <w:t>&lt;standaard wachtwoord&gt;</w:t>
-            </w:r>
+                <w:lang w:val="en-NL"/>
+              </w:rPr>
+            </w:pPr>
+            <w:proofErr w:type="gramStart"/>
+            <w:r>
+              <w:rPr>
+                <w:rFonts w:ascii="Arial" w:hAnsi="Arial" w:cs="Arial"/>
+                <w:sz w:val="24"/>
+                <w:szCs w:val="24"/>
+                <w:lang w:val="en-NL"/>
+              </w:rPr>
+              <w:t>!pinger</w:t>
+            </w:r>
+            <w:proofErr w:type="gramEnd"/>
+            <w:r>
+              <w:rPr>
+                <w:rFonts w:ascii="Arial" w:hAnsi="Arial" w:cs="Arial"/>
+                <w:sz w:val="24"/>
+                <w:szCs w:val="24"/>
+                <w:lang w:val="en-NL"/>
+              </w:rPr>
+              <w:t>65srr</w:t>
+            </w:r>
+          </w:p>
+          <w:p>
+            <w:pPr>
+              <w:rPr>
+                <w:rFonts w:ascii="Arial" w:hAnsi="Arial" w:cs="Arial"/>
+                <w:sz w:val="24"/>
+                <w:szCs w:val="24"/>
+              </w:rPr>
+            </w:pPr>
           </w:p>
         </w:tc>
       </w:tr>
@@ -528,23 +564,13 @@
                 <w:szCs w:val="24"/>
               </w:rPr>
             </w:pPr>
-            <w:proofErr w:type="spellStart"/>
-            <w:r>
-              <w:rPr>
-                <w:rFonts w:ascii="Arial" w:hAnsi="Arial" w:cs="Arial"/>
-                <w:sz w:val="24"/>
-                <w:szCs w:val="24"/>
-              </w:rPr>
-              <w:t>Session</w:t>
-            </w:r>
-            <w:proofErr w:type="spellEnd"/>
-            <w:r>
-              <w:rPr>
-                <w:rFonts w:ascii="Arial" w:hAnsi="Arial" w:cs="Arial"/>
-                <w:sz w:val="24"/>
-                <w:szCs w:val="24"/>
-              </w:rPr>
-              <w:t xml:space="preserve"> variabelen</w:t>
+            <w:r>
+              <w:rPr>
+                <w:rFonts w:ascii="Arial" w:hAnsi="Arial" w:cs="Arial"/>
+                <w:sz w:val="24"/>
+                <w:szCs w:val="24"/>
+              </w:rPr>
+              <w:t>Session variabelen</w:t>
             </w:r>
           </w:p>
         </w:tc>
@@ -806,7 +832,7 @@
     </w:p>
     <w:tbl>
       <w:tblPr>
-        <w:tblStyle w:val="Tabelraster"/>
+        <w:tblStyle w:val="TableGrid"/>
         <w:tblW w:w="0" w:type="auto"/>
         <w:tblLook w:val="04A0" w:firstRow="1" w:lastRow="0" w:firstColumn="1" w:lastColumn="0" w:noHBand="0" w:noVBand="1"/>
       </w:tblPr>
@@ -1125,7 +1151,7 @@
     </w:p>
     <w:tbl>
       <w:tblPr>
-        <w:tblStyle w:val="Tabelraster"/>
+        <w:tblStyle w:val="TableGrid"/>
         <w:tblW w:w="0" w:type="auto"/>
         <w:tblLook w:val="04A0" w:firstRow="1" w:lastRow="0" w:firstColumn="1" w:lastColumn="0" w:noHBand="0" w:noVBand="1"/>
       </w:tblPr>
@@ -1258,14 +1284,6 @@
                 <w:szCs w:val="24"/>
               </w:rPr>
             </w:pPr>
-            <w:r>
-              <w:rPr>
-                <w:rFonts w:ascii="Arial" w:hAnsi="Arial" w:cs="Arial"/>
-                <w:sz w:val="24"/>
-                <w:szCs w:val="24"/>
-              </w:rPr>
-              <w:t>Team 03</w:t>
-            </w:r>
           </w:p>
         </w:tc>
         <w:tc>
@@ -1280,14 +1298,6 @@
                 <w:szCs w:val="24"/>
               </w:rPr>
             </w:pPr>
-            <w:r>
-              <w:rPr>
-                <w:rFonts w:ascii="Arial" w:hAnsi="Arial" w:cs="Arial"/>
-                <w:sz w:val="24"/>
-                <w:szCs w:val="24"/>
-              </w:rPr>
-              <w:t>Carlos</w:t>
-            </w:r>
           </w:p>
         </w:tc>
         <w:tc>
@@ -1302,24 +1312,6 @@
                 <w:szCs w:val="24"/>
               </w:rPr>
             </w:pPr>
-            <w:r>
-              <w:rPr>
-                <w:rFonts w:ascii="Arial" w:hAnsi="Arial" w:cs="Arial"/>
-                <w:sz w:val="24"/>
-                <w:szCs w:val="24"/>
-              </w:rPr>
-              <w:t xml:space="preserve">In </w:t>
-            </w:r>
-            <w:proofErr w:type="spellStart"/>
-            <w:r>
-              <w:rPr>
-                <w:rFonts w:ascii="Arial" w:hAnsi="Arial" w:cs="Arial"/>
-                <w:sz w:val="24"/>
-                <w:szCs w:val="24"/>
-              </w:rPr>
-              <w:t>progress</w:t>
-            </w:r>
-            <w:proofErr w:type="spellEnd"/>
           </w:p>
         </w:tc>
         <w:tc>
@@ -1334,32 +1326,6 @@
                 <w:szCs w:val="24"/>
               </w:rPr>
             </w:pPr>
-            <w:r>
-              <w:rPr>
-                <w:rFonts w:ascii="Arial" w:hAnsi="Arial" w:cs="Arial"/>
-                <w:sz w:val="24"/>
-                <w:szCs w:val="24"/>
-              </w:rPr>
-              <w:t>Afgerond, naar kolom “</w:t>
-            </w:r>
-            <w:proofErr w:type="spellStart"/>
-            <w:r>
-              <w:rPr>
-                <w:rFonts w:ascii="Arial" w:hAnsi="Arial" w:cs="Arial"/>
-                <w:sz w:val="24"/>
-                <w:szCs w:val="24"/>
-              </w:rPr>
-              <w:t>Testing</w:t>
-            </w:r>
-            <w:proofErr w:type="spellEnd"/>
-            <w:r>
-              <w:rPr>
-                <w:rFonts w:ascii="Arial" w:hAnsi="Arial" w:cs="Arial"/>
-                <w:sz w:val="24"/>
-                <w:szCs w:val="24"/>
-              </w:rPr>
-              <w:t xml:space="preserve">” (Danielle) </w:t>
-            </w:r>
           </w:p>
         </w:tc>
       </w:tr>
@@ -1376,14 +1342,6 @@
                 <w:szCs w:val="24"/>
               </w:rPr>
             </w:pPr>
-            <w:r>
-              <w:rPr>
-                <w:rFonts w:ascii="Arial" w:hAnsi="Arial" w:cs="Arial"/>
-                <w:sz w:val="24"/>
-                <w:szCs w:val="24"/>
-              </w:rPr>
-              <w:t>B-02-01</w:t>
-            </w:r>
           </w:p>
         </w:tc>
         <w:tc>
@@ -1398,14 +1356,6 @@
                 <w:szCs w:val="24"/>
               </w:rPr>
             </w:pPr>
-            <w:r>
-              <w:rPr>
-                <w:rFonts w:ascii="Arial" w:hAnsi="Arial" w:cs="Arial"/>
-                <w:sz w:val="24"/>
-                <w:szCs w:val="24"/>
-              </w:rPr>
-              <w:t>Jeremiah</w:t>
-            </w:r>
           </w:p>
         </w:tc>
         <w:tc>
@@ -1420,34 +1370,6 @@
                 <w:szCs w:val="24"/>
               </w:rPr>
             </w:pPr>
-            <w:proofErr w:type="spellStart"/>
-            <w:r>
-              <w:rPr>
-                <w:rFonts w:ascii="Arial" w:hAnsi="Arial" w:cs="Arial"/>
-                <w:sz w:val="24"/>
-                <w:szCs w:val="24"/>
-              </w:rPr>
-              <w:t>Spr</w:t>
-            </w:r>
-            <w:proofErr w:type="spellEnd"/>
-            <w:r>
-              <w:rPr>
-                <w:rFonts w:ascii="Arial" w:hAnsi="Arial" w:cs="Arial"/>
-                <w:sz w:val="24"/>
-                <w:szCs w:val="24"/>
-              </w:rPr>
-              <w:t xml:space="preserve"> </w:t>
-            </w:r>
-            <w:proofErr w:type="spellStart"/>
-            <w:r>
-              <w:rPr>
-                <w:rFonts w:ascii="Arial" w:hAnsi="Arial" w:cs="Arial"/>
-                <w:sz w:val="24"/>
-                <w:szCs w:val="24"/>
-              </w:rPr>
-              <w:t>backlog</w:t>
-            </w:r>
-            <w:proofErr w:type="spellEnd"/>
           </w:p>
         </w:tc>
         <w:tc>
@@ -1462,14 +1384,6 @@
                 <w:szCs w:val="24"/>
               </w:rPr>
             </w:pPr>
-            <w:r>
-              <w:rPr>
-                <w:rFonts w:ascii="Arial" w:hAnsi="Arial" w:cs="Arial"/>
-                <w:sz w:val="24"/>
-                <w:szCs w:val="24"/>
-              </w:rPr>
-              <w:t>Opsplitsen in taken voor overzicht</w:t>
-            </w:r>
           </w:p>
         </w:tc>
       </w:tr>
@@ -1726,7 +1640,7 @@
 </file>
 
 <file path=word/styles.xml><?xml version="1.0" encoding="utf-8"?>
-<w:styles xmlns:mc="http://schemas.openxmlformats.org/markup-compatibility/2006" xmlns:r="http://schemas.openxmlformats.org/officeDocument/2006/relationships" xmlns:w="http://schemas.openxmlformats.org/wordprocessingml/2006/main" xmlns:w14="http://schemas.microsoft.com/office/word/2010/wordml" xmlns:w15="http://schemas.microsoft.com/office/word/2012/wordml" xmlns:w16cex="http://schemas.microsoft.com/office/word/2018/wordml/cex" xmlns:w16cid="http://schemas.microsoft.com/office/word/2016/wordml/cid" xmlns:w16="http://schemas.microsoft.com/office/word/2018/wordml" xmlns:w16sdtdh="http://schemas.microsoft.com/office/word/2020/wordml/sdtdatahash" xmlns:w16se="http://schemas.microsoft.com/office/word/2015/wordml/symex" mc:Ignorable="w14 w15 w16se w16cid w16 w16cex w16sdtdh">
+<w:styles xmlns:mc="http://schemas.openxmlformats.org/markup-compatibility/2006" xmlns:r="http://schemas.openxmlformats.org/officeDocument/2006/relationships" xmlns:w="http://schemas.openxmlformats.org/wordprocessingml/2006/main" xmlns:w14="http://schemas.microsoft.com/office/word/2010/wordml" xmlns:w15="http://schemas.microsoft.com/office/word/2012/wordml" xmlns:w16cex="http://schemas.microsoft.com/office/word/2018/wordml/cex" xmlns:w16cid="http://schemas.microsoft.com/office/word/2016/wordml/cid" xmlns:w16="http://schemas.microsoft.com/office/word/2018/wordml" xmlns:w16du="http://schemas.microsoft.com/office/word/2023/wordml/word16du" xmlns:w16sdtdh="http://schemas.microsoft.com/office/word/2020/wordml/sdtdatahash" xmlns:w16sdtfl="http://schemas.microsoft.com/office/word/2024/wordml/sdtformatlock" xmlns:w16se="http://schemas.microsoft.com/office/word/2015/wordml/symex" mc:Ignorable="w14 w15 w16se w16cid w16 w16cex w16sdtdh w16sdtfl w16du">
   <w:docDefaults>
     <w:rPrDefault>
       <w:rPr>
@@ -2122,15 +2036,15 @@
     <w:lsdException w:name="Unresolved Mention" w:semiHidden="1" w:unhideWhenUsed="1"/>
     <w:lsdException w:name="Smart Link" w:semiHidden="1" w:unhideWhenUsed="1"/>
   </w:latentStyles>
-  <w:style w:type="paragraph" w:default="1" w:styleId="Standaard">
+  <w:style w:type="paragraph" w:default="1" w:styleId="Normal">
     <w:name w:val="Normal"/>
     <w:qFormat/>
   </w:style>
-  <w:style w:type="paragraph" w:styleId="Kop1">
+  <w:style w:type="paragraph" w:styleId="Heading1">
     <w:name w:val="heading 1"/>
-    <w:basedOn w:val="Standaard"/>
-    <w:next w:val="Standaard"/>
-    <w:link w:val="Kop1Char"/>
+    <w:basedOn w:val="Normal"/>
+    <w:next w:val="Normal"/>
+    <w:link w:val="Heading1Char"/>
     <w:uiPriority w:val="9"/>
     <w:qFormat/>
     <w:rsid w:val="00362C25"/>
@@ -2147,11 +2061,11 @@
       <w:szCs w:val="40"/>
     </w:rPr>
   </w:style>
-  <w:style w:type="paragraph" w:styleId="Kop2">
+  <w:style w:type="paragraph" w:styleId="Heading2">
     <w:name w:val="heading 2"/>
-    <w:basedOn w:val="Standaard"/>
-    <w:next w:val="Standaard"/>
-    <w:link w:val="Kop2Char"/>
+    <w:basedOn w:val="Normal"/>
+    <w:next w:val="Normal"/>
+    <w:link w:val="Heading2Char"/>
     <w:uiPriority w:val="9"/>
     <w:semiHidden/>
     <w:unhideWhenUsed/>
@@ -2170,11 +2084,11 @@
       <w:szCs w:val="32"/>
     </w:rPr>
   </w:style>
-  <w:style w:type="paragraph" w:styleId="Kop3">
+  <w:style w:type="paragraph" w:styleId="Heading3">
     <w:name w:val="heading 3"/>
-    <w:basedOn w:val="Standaard"/>
-    <w:next w:val="Standaard"/>
-    <w:link w:val="Kop3Char"/>
+    <w:basedOn w:val="Normal"/>
+    <w:next w:val="Normal"/>
+    <w:link w:val="Heading3Char"/>
     <w:uiPriority w:val="9"/>
     <w:semiHidden/>
     <w:unhideWhenUsed/>
@@ -2193,11 +2107,11 @@
       <w:szCs w:val="28"/>
     </w:rPr>
   </w:style>
-  <w:style w:type="paragraph" w:styleId="Kop4">
+  <w:style w:type="paragraph" w:styleId="Heading4">
     <w:name w:val="heading 4"/>
-    <w:basedOn w:val="Standaard"/>
-    <w:next w:val="Standaard"/>
-    <w:link w:val="Kop4Char"/>
+    <w:basedOn w:val="Normal"/>
+    <w:next w:val="Normal"/>
+    <w:link w:val="Heading4Char"/>
     <w:uiPriority w:val="9"/>
     <w:semiHidden/>
     <w:unhideWhenUsed/>
@@ -2216,11 +2130,11 @@
       <w:color w:val="0F4761" w:themeColor="accent1" w:themeShade="BF"/>
     </w:rPr>
   </w:style>
-  <w:style w:type="paragraph" w:styleId="Kop5">
+  <w:style w:type="paragraph" w:styleId="Heading5">
     <w:name w:val="heading 5"/>
-    <w:basedOn w:val="Standaard"/>
-    <w:next w:val="Standaard"/>
-    <w:link w:val="Kop5Char"/>
+    <w:basedOn w:val="Normal"/>
+    <w:next w:val="Normal"/>
+    <w:link w:val="Heading5Char"/>
     <w:uiPriority w:val="9"/>
     <w:semiHidden/>
     <w:unhideWhenUsed/>
@@ -2237,11 +2151,11 @@
       <w:color w:val="0F4761" w:themeColor="accent1" w:themeShade="BF"/>
     </w:rPr>
   </w:style>
-  <w:style w:type="paragraph" w:styleId="Kop6">
+  <w:style w:type="paragraph" w:styleId="Heading6">
     <w:name w:val="heading 6"/>
-    <w:basedOn w:val="Standaard"/>
-    <w:next w:val="Standaard"/>
-    <w:link w:val="Kop6Char"/>
+    <w:basedOn w:val="Normal"/>
+    <w:next w:val="Normal"/>
+    <w:link w:val="Heading6Char"/>
     <w:uiPriority w:val="9"/>
     <w:semiHidden/>
     <w:unhideWhenUsed/>
@@ -2260,11 +2174,11 @@
       <w:color w:val="595959" w:themeColor="text1" w:themeTint="A6"/>
     </w:rPr>
   </w:style>
-  <w:style w:type="paragraph" w:styleId="Kop7">
+  <w:style w:type="paragraph" w:styleId="Heading7">
     <w:name w:val="heading 7"/>
-    <w:basedOn w:val="Standaard"/>
-    <w:next w:val="Standaard"/>
-    <w:link w:val="Kop7Char"/>
+    <w:basedOn w:val="Normal"/>
+    <w:next w:val="Normal"/>
+    <w:link w:val="Heading7Char"/>
     <w:uiPriority w:val="9"/>
     <w:semiHidden/>
     <w:unhideWhenUsed/>
@@ -2281,11 +2195,11 @@
       <w:color w:val="595959" w:themeColor="text1" w:themeTint="A6"/>
     </w:rPr>
   </w:style>
-  <w:style w:type="paragraph" w:styleId="Kop8">
+  <w:style w:type="paragraph" w:styleId="Heading8">
     <w:name w:val="heading 8"/>
-    <w:basedOn w:val="Standaard"/>
-    <w:next w:val="Standaard"/>
-    <w:link w:val="Kop8Char"/>
+    <w:basedOn w:val="Normal"/>
+    <w:next w:val="Normal"/>
+    <w:link w:val="Heading8Char"/>
     <w:uiPriority w:val="9"/>
     <w:semiHidden/>
     <w:unhideWhenUsed/>
@@ -2304,11 +2218,11 @@
       <w:color w:val="272727" w:themeColor="text1" w:themeTint="D8"/>
     </w:rPr>
   </w:style>
-  <w:style w:type="paragraph" w:styleId="Kop9">
+  <w:style w:type="paragraph" w:styleId="Heading9">
     <w:name w:val="heading 9"/>
-    <w:basedOn w:val="Standaard"/>
-    <w:next w:val="Standaard"/>
-    <w:link w:val="Kop9Char"/>
+    <w:basedOn w:val="Normal"/>
+    <w:next w:val="Normal"/>
+    <w:link w:val="Heading9Char"/>
     <w:uiPriority w:val="9"/>
     <w:semiHidden/>
     <w:unhideWhenUsed/>
@@ -2325,13 +2239,12 @@
       <w:color w:val="272727" w:themeColor="text1" w:themeTint="D8"/>
     </w:rPr>
   </w:style>
-  <w:style w:type="character" w:default="1" w:styleId="Standaardalinea-lettertype">
+  <w:style w:type="character" w:default="1" w:styleId="DefaultParagraphFont">
     <w:name w:val="Default Paragraph Font"/>
     <w:uiPriority w:val="1"/>
-    <w:semiHidden/>
     <w:unhideWhenUsed/>
   </w:style>
-  <w:style w:type="table" w:default="1" w:styleId="Standaardtabel">
+  <w:style w:type="table" w:default="1" w:styleId="TableNormal">
     <w:name w:val="Normal Table"/>
     <w:uiPriority w:val="99"/>
     <w:semiHidden/>
@@ -2346,16 +2259,16 @@
       </w:tblCellMar>
     </w:tblPr>
   </w:style>
-  <w:style w:type="numbering" w:default="1" w:styleId="Geenlijst">
+  <w:style w:type="numbering" w:default="1" w:styleId="NoList">
     <w:name w:val="No List"/>
     <w:uiPriority w:val="99"/>
     <w:semiHidden/>
     <w:unhideWhenUsed/>
   </w:style>
-  <w:style w:type="character" w:customStyle="1" w:styleId="Kop1Char">
-    <w:name w:val="Kop 1 Char"/>
-    <w:basedOn w:val="Standaardalinea-lettertype"/>
-    <w:link w:val="Kop1"/>
+  <w:style w:type="character" w:customStyle="1" w:styleId="Heading1Char">
+    <w:name w:val="Heading 1 Char"/>
+    <w:basedOn w:val="DefaultParagraphFont"/>
+    <w:link w:val="Heading1"/>
     <w:uiPriority w:val="9"/>
     <w:rsid w:val="00362C25"/>
     <w:rPr>
@@ -2365,10 +2278,10 @@
       <w:szCs w:val="40"/>
     </w:rPr>
   </w:style>
-  <w:style w:type="character" w:customStyle="1" w:styleId="Kop2Char">
-    <w:name w:val="Kop 2 Char"/>
-    <w:basedOn w:val="Standaardalinea-lettertype"/>
-    <w:link w:val="Kop2"/>
+  <w:style w:type="character" w:customStyle="1" w:styleId="Heading2Char">
+    <w:name w:val="Heading 2 Char"/>
+    <w:basedOn w:val="DefaultParagraphFont"/>
+    <w:link w:val="Heading2"/>
     <w:uiPriority w:val="9"/>
     <w:semiHidden/>
     <w:rsid w:val="00362C25"/>
@@ -2379,10 +2292,10 @@
       <w:szCs w:val="32"/>
     </w:rPr>
   </w:style>
-  <w:style w:type="character" w:customStyle="1" w:styleId="Kop3Char">
-    <w:name w:val="Kop 3 Char"/>
-    <w:basedOn w:val="Standaardalinea-lettertype"/>
-    <w:link w:val="Kop3"/>
+  <w:style w:type="character" w:customStyle="1" w:styleId="Heading3Char">
+    <w:name w:val="Heading 3 Char"/>
+    <w:basedOn w:val="DefaultParagraphFont"/>
+    <w:link w:val="Heading3"/>
     <w:uiPriority w:val="9"/>
     <w:semiHidden/>
     <w:rsid w:val="00362C25"/>
@@ -2393,10 +2306,10 @@
       <w:szCs w:val="28"/>
     </w:rPr>
   </w:style>
-  <w:style w:type="character" w:customStyle="1" w:styleId="Kop4Char">
-    <w:name w:val="Kop 4 Char"/>
-    <w:basedOn w:val="Standaardalinea-lettertype"/>
-    <w:link w:val="Kop4"/>
+  <w:style w:type="character" w:customStyle="1" w:styleId="Heading4Char">
+    <w:name w:val="Heading 4 Char"/>
+    <w:basedOn w:val="DefaultParagraphFont"/>
+    <w:link w:val="Heading4"/>
     <w:uiPriority w:val="9"/>
     <w:semiHidden/>
     <w:rsid w:val="00362C25"/>
@@ -2407,10 +2320,10 @@
       <w:color w:val="0F4761" w:themeColor="accent1" w:themeShade="BF"/>
     </w:rPr>
   </w:style>
-  <w:style w:type="character" w:customStyle="1" w:styleId="Kop5Char">
-    <w:name w:val="Kop 5 Char"/>
-    <w:basedOn w:val="Standaardalinea-lettertype"/>
-    <w:link w:val="Kop5"/>
+  <w:style w:type="character" w:customStyle="1" w:styleId="Heading5Char">
+    <w:name w:val="Heading 5 Char"/>
+    <w:basedOn w:val="DefaultParagraphFont"/>
+    <w:link w:val="Heading5"/>
     <w:uiPriority w:val="9"/>
     <w:semiHidden/>
     <w:rsid w:val="00362C25"/>
@@ -2419,10 +2332,10 @@
       <w:color w:val="0F4761" w:themeColor="accent1" w:themeShade="BF"/>
     </w:rPr>
   </w:style>
-  <w:style w:type="character" w:customStyle="1" w:styleId="Kop6Char">
-    <w:name w:val="Kop 6 Char"/>
-    <w:basedOn w:val="Standaardalinea-lettertype"/>
-    <w:link w:val="Kop6"/>
+  <w:style w:type="character" w:customStyle="1" w:styleId="Heading6Char">
+    <w:name w:val="Heading 6 Char"/>
+    <w:basedOn w:val="DefaultParagraphFont"/>
+    <w:link w:val="Heading6"/>
     <w:uiPriority w:val="9"/>
     <w:semiHidden/>
     <w:rsid w:val="00362C25"/>
@@ -2433,10 +2346,10 @@
       <w:color w:val="595959" w:themeColor="text1" w:themeTint="A6"/>
     </w:rPr>
   </w:style>
-  <w:style w:type="character" w:customStyle="1" w:styleId="Kop7Char">
-    <w:name w:val="Kop 7 Char"/>
-    <w:basedOn w:val="Standaardalinea-lettertype"/>
-    <w:link w:val="Kop7"/>
+  <w:style w:type="character" w:customStyle="1" w:styleId="Heading7Char">
+    <w:name w:val="Heading 7 Char"/>
+    <w:basedOn w:val="DefaultParagraphFont"/>
+    <w:link w:val="Heading7"/>
     <w:uiPriority w:val="9"/>
     <w:semiHidden/>
     <w:rsid w:val="00362C25"/>
@@ -2445,10 +2358,10 @@
       <w:color w:val="595959" w:themeColor="text1" w:themeTint="A6"/>
     </w:rPr>
   </w:style>
-  <w:style w:type="character" w:customStyle="1" w:styleId="Kop8Char">
-    <w:name w:val="Kop 8 Char"/>
-    <w:basedOn w:val="Standaardalinea-lettertype"/>
-    <w:link w:val="Kop8"/>
+  <w:style w:type="character" w:customStyle="1" w:styleId="Heading8Char">
+    <w:name w:val="Heading 8 Char"/>
+    <w:basedOn w:val="DefaultParagraphFont"/>
+    <w:link w:val="Heading8"/>
     <w:uiPriority w:val="9"/>
     <w:semiHidden/>
     <w:rsid w:val="00362C25"/>
@@ -2459,10 +2372,10 @@
       <w:color w:val="272727" w:themeColor="text1" w:themeTint="D8"/>
     </w:rPr>
   </w:style>
-  <w:style w:type="character" w:customStyle="1" w:styleId="Kop9Char">
-    <w:name w:val="Kop 9 Char"/>
-    <w:basedOn w:val="Standaardalinea-lettertype"/>
-    <w:link w:val="Kop9"/>
+  <w:style w:type="character" w:customStyle="1" w:styleId="Heading9Char">
+    <w:name w:val="Heading 9 Char"/>
+    <w:basedOn w:val="DefaultParagraphFont"/>
+    <w:link w:val="Heading9"/>
     <w:uiPriority w:val="9"/>
     <w:semiHidden/>
     <w:rsid w:val="00362C25"/>
@@ -2471,11 +2384,11 @@
       <w:color w:val="272727" w:themeColor="text1" w:themeTint="D8"/>
     </w:rPr>
   </w:style>
-  <w:style w:type="paragraph" w:styleId="Titel">
+  <w:style w:type="paragraph" w:styleId="Title">
     <w:name w:val="Title"/>
-    <w:basedOn w:val="Standaard"/>
-    <w:next w:val="Standaard"/>
-    <w:link w:val="TitelChar"/>
+    <w:basedOn w:val="Normal"/>
+    <w:next w:val="Normal"/>
+    <w:link w:val="TitleChar"/>
     <w:uiPriority w:val="10"/>
     <w:qFormat/>
     <w:rsid w:val="00362C25"/>
@@ -2491,10 +2404,10 @@
       <w:szCs w:val="56"/>
     </w:rPr>
   </w:style>
-  <w:style w:type="character" w:customStyle="1" w:styleId="TitelChar">
-    <w:name w:val="Titel Char"/>
-    <w:basedOn w:val="Standaardalinea-lettertype"/>
-    <w:link w:val="Titel"/>
+  <w:style w:type="character" w:customStyle="1" w:styleId="TitleChar">
+    <w:name w:val="Title Char"/>
+    <w:basedOn w:val="DefaultParagraphFont"/>
+    <w:link w:val="Title"/>
     <w:uiPriority w:val="10"/>
     <w:rsid w:val="00362C25"/>
     <w:rPr>
@@ -2505,11 +2418,11 @@
       <w:szCs w:val="56"/>
     </w:rPr>
   </w:style>
-  <w:style w:type="paragraph" w:styleId="Ondertitel">
+  <w:style w:type="paragraph" w:styleId="Subtitle">
     <w:name w:val="Subtitle"/>
-    <w:basedOn w:val="Standaard"/>
-    <w:next w:val="Standaard"/>
-    <w:link w:val="OndertitelChar"/>
+    <w:basedOn w:val="Normal"/>
+    <w:next w:val="Normal"/>
+    <w:link w:val="SubtitleChar"/>
     <w:uiPriority w:val="11"/>
     <w:qFormat/>
     <w:rsid w:val="00362C25"/>
@@ -2526,10 +2439,10 @@
       <w:szCs w:val="28"/>
     </w:rPr>
   </w:style>
-  <w:style w:type="character" w:customStyle="1" w:styleId="OndertitelChar">
-    <w:name w:val="Ondertitel Char"/>
-    <w:basedOn w:val="Standaardalinea-lettertype"/>
-    <w:link w:val="Ondertitel"/>
+  <w:style w:type="character" w:customStyle="1" w:styleId="SubtitleChar">
+    <w:name w:val="Subtitle Char"/>
+    <w:basedOn w:val="DefaultParagraphFont"/>
+    <w:link w:val="Subtitle"/>
     <w:uiPriority w:val="11"/>
     <w:rsid w:val="00362C25"/>
     <w:rPr>
@@ -2540,11 +2453,11 @@
       <w:szCs w:val="28"/>
     </w:rPr>
   </w:style>
-  <w:style w:type="paragraph" w:styleId="Citaat">
+  <w:style w:type="paragraph" w:styleId="Quote">
     <w:name w:val="Quote"/>
-    <w:basedOn w:val="Standaard"/>
-    <w:next w:val="Standaard"/>
-    <w:link w:val="CitaatChar"/>
+    <w:basedOn w:val="Normal"/>
+    <w:next w:val="Normal"/>
+    <w:link w:val="QuoteChar"/>
     <w:uiPriority w:val="29"/>
     <w:qFormat/>
     <w:rsid w:val="00362C25"/>
@@ -2558,10 +2471,10 @@
       <w:color w:val="404040" w:themeColor="text1" w:themeTint="BF"/>
     </w:rPr>
   </w:style>
-  <w:style w:type="character" w:customStyle="1" w:styleId="CitaatChar">
-    <w:name w:val="Citaat Char"/>
-    <w:basedOn w:val="Standaardalinea-lettertype"/>
-    <w:link w:val="Citaat"/>
+  <w:style w:type="character" w:customStyle="1" w:styleId="QuoteChar">
+    <w:name w:val="Quote Char"/>
+    <w:basedOn w:val="DefaultParagraphFont"/>
+    <w:link w:val="Quote"/>
     <w:uiPriority w:val="29"/>
     <w:rsid w:val="00362C25"/>
     <w:rPr>
@@ -2570,9 +2483,9 @@
       <w:color w:val="404040" w:themeColor="text1" w:themeTint="BF"/>
     </w:rPr>
   </w:style>
-  <w:style w:type="paragraph" w:styleId="Lijstalinea">
+  <w:style w:type="paragraph" w:styleId="ListParagraph">
     <w:name w:val="List Paragraph"/>
-    <w:basedOn w:val="Standaard"/>
+    <w:basedOn w:val="Normal"/>
     <w:uiPriority w:val="34"/>
     <w:qFormat/>
     <w:rsid w:val="00362C25"/>
@@ -2581,9 +2494,9 @@
       <w:contextualSpacing/>
     </w:pPr>
   </w:style>
-  <w:style w:type="character" w:styleId="Intensievebenadrukking">
+  <w:style w:type="character" w:styleId="IntenseEmphasis">
     <w:name w:val="Intense Emphasis"/>
-    <w:basedOn w:val="Standaardalinea-lettertype"/>
+    <w:basedOn w:val="DefaultParagraphFont"/>
     <w:uiPriority w:val="21"/>
     <w:qFormat/>
     <w:rsid w:val="00362C25"/>
@@ -2593,11 +2506,11 @@
       <w:color w:val="0F4761" w:themeColor="accent1" w:themeShade="BF"/>
     </w:rPr>
   </w:style>
-  <w:style w:type="paragraph" w:styleId="Duidelijkcitaat">
+  <w:style w:type="paragraph" w:styleId="IntenseQuote">
     <w:name w:val="Intense Quote"/>
-    <w:basedOn w:val="Standaard"/>
-    <w:next w:val="Standaard"/>
-    <w:link w:val="DuidelijkcitaatChar"/>
+    <w:basedOn w:val="Normal"/>
+    <w:next w:val="Normal"/>
+    <w:link w:val="IntenseQuoteChar"/>
     <w:uiPriority w:val="30"/>
     <w:qFormat/>
     <w:rsid w:val="00362C25"/>
@@ -2616,10 +2529,10 @@
       <w:color w:val="0F4761" w:themeColor="accent1" w:themeShade="BF"/>
     </w:rPr>
   </w:style>
-  <w:style w:type="character" w:customStyle="1" w:styleId="DuidelijkcitaatChar">
-    <w:name w:val="Duidelijk citaat Char"/>
-    <w:basedOn w:val="Standaardalinea-lettertype"/>
-    <w:link w:val="Duidelijkcitaat"/>
+  <w:style w:type="character" w:customStyle="1" w:styleId="IntenseQuoteChar">
+    <w:name w:val="Intense Quote Char"/>
+    <w:basedOn w:val="DefaultParagraphFont"/>
+    <w:link w:val="IntenseQuote"/>
     <w:uiPriority w:val="30"/>
     <w:rsid w:val="00362C25"/>
     <w:rPr>
@@ -2628,9 +2541,9 @@
       <w:color w:val="0F4761" w:themeColor="accent1" w:themeShade="BF"/>
     </w:rPr>
   </w:style>
-  <w:style w:type="character" w:styleId="Intensieveverwijzing">
+  <w:style w:type="character" w:styleId="IntenseReference">
     <w:name w:val="Intense Reference"/>
-    <w:basedOn w:val="Standaardalinea-lettertype"/>
+    <w:basedOn w:val="DefaultParagraphFont"/>
     <w:uiPriority w:val="32"/>
     <w:qFormat/>
     <w:rsid w:val="00362C25"/>
@@ -2642,9 +2555,9 @@
       <w:spacing w:val="5"/>
     </w:rPr>
   </w:style>
-  <w:style w:type="table" w:styleId="Tabelraster">
+  <w:style w:type="table" w:styleId="TableGrid">
     <w:name w:val="Table Grid"/>
-    <w:basedOn w:val="Standaardtabel"/>
+    <w:basedOn w:val="TableNormal"/>
     <w:uiPriority w:val="39"/>
     <w:rsid w:val="00362C25"/>
     <w:pPr>

</xml_diff>